<commit_message>
Cronograma: clases los miércoles, en línea, feriados de Ecuador
- 33 sesiones del 7 oct al 30 jun; ningún feriado nacional cae en miércoles.
- Bloque Puente de 5 sesiones con lectura previa de MÓLÓ (clase invertida),
  laboratorio de pandas y ML clásico en clase.
- Semana 1: Git/GitHub en la práctica y Python orientado a objetos; sin test
  de ubicación (cada estudiante elige su nivel).
- Bloque 5 con una segunda sesión de técnica de competencia.
- "Verano" pasa a "Receso de fin de año".

Co-Authored-By: Claude Opus 5.5 <noreply@anthropic.com>
Claude-Session: https://claude.ai/code/session_018iuMFc81FjA8AcaabZvkyk
</commit_message>
<xml_diff>
--- a/Guia_estudiante.docx
+++ b/Guia_estudiante.docx
@@ -22,7 +22,7 @@
     <w:p>
       <w:pPr/>
       <w:r>
-        <w:t xml:space="preserve">Este es un curso anual de deep learning que empieza el Oct 5, 2026 y termina a fines de junio de 2027. Nos vemos una vez por semana (2 horas), pero la mayor parte del aprendizaje ocurre fuera de clase: esperamos entre 4 y 5 horas semanales de trabajo tuyo.</w:t>
+        <w:t xml:space="preserve">Este es un curso anual de deep learning que empieza el Oct 7, 2026 y termina el 30 de junio de 2027. Nos vemos en línea una vez por semana, los miércoles (2 horas), pero la mayor parte del aprendizaje ocurre fuera de clase: esperamos entre 4 y 5 horas semanales de trabajo tuyo.</w:t>
       </w:r>
     </w:p>
     <w:p>
@@ -139,18 +139,18 @@
           <w:p>
             <w:pPr/>
             <w:r>
-              <w:t xml:space="preserve">5 oct – 2 nov</w:t>
-            </w:r>
-          </w:p>
-        </w:tc>
-        <w:tc>
-          <w:tcPr>
-            <w:tcW w:w="3120" w:type="dxa"/>
-          </w:tcPr>
-          <w:p>
-            <w:pPr/>
-            <w:r>
-              <w:t xml:space="preserve">Repaso de Python/NumPy, matemática para deep learning y ML clásico</w:t>
+              <w:t xml:space="preserve">7 oct – 4 nov</w:t>
+            </w:r>
+          </w:p>
+        </w:tc>
+        <w:tc>
+          <w:tcPr>
+            <w:tcW w:w="3120" w:type="dxa"/>
+          </w:tcPr>
+          <w:p>
+            <w:pPr/>
+            <w:r>
+              <w:t xml:space="preserve">Repaso de Python/NumPy, datos con pandas, matemática para deep learning y ML clásico</w:t>
             </w:r>
           </w:p>
         </w:tc>
@@ -174,7 +174,7 @@
           <w:p>
             <w:pPr/>
             <w:r>
-              <w:t xml:space="preserve">9 nov – 14 dic</w:t>
+              <w:t xml:space="preserve">11 nov – 16 dic</w:t>
             </w:r>
           </w:p>
         </w:tc>
@@ -198,18 +198,18 @@
           <w:p>
             <w:pPr/>
             <w:r>
-              <w:t xml:space="preserve">Verano</w:t>
-            </w:r>
-          </w:p>
-        </w:tc>
-        <w:tc>
-          <w:tcPr>
-            <w:tcW w:w="3120" w:type="dxa"/>
-          </w:tcPr>
-          <w:p>
-            <w:pPr/>
-            <w:r>
-              <w:t xml:space="preserve">Enero</w:t>
+              <w:t xml:space="preserve">Receso de fin de año</w:t>
+            </w:r>
+          </w:p>
+        </w:tc>
+        <w:tc>
+          <w:tcPr>
+            <w:tcW w:w="3120" w:type="dxa"/>
+          </w:tcPr>
+          <w:p>
+            <w:pPr/>
+            <w:r>
+              <w:t xml:space="preserve">17 dic – 2 feb</w:t>
             </w:r>
           </w:p>
         </w:tc>
@@ -244,7 +244,7 @@
           <w:p>
             <w:pPr/>
             <w:r>
-              <w:t xml:space="preserve">1 feb – 29 mar</w:t>
+              <w:t xml:space="preserve">3 feb – 24 mar</w:t>
             </w:r>
           </w:p>
         </w:tc>
@@ -279,7 +279,7 @@
           <w:p>
             <w:pPr/>
             <w:r>
-              <w:t xml:space="preserve">5 abr – 24 may</w:t>
+              <w:t xml:space="preserve">31 mar – 19 may</w:t>
             </w:r>
           </w:p>
         </w:tc>
@@ -314,7 +314,7 @@
           <w:p>
             <w:pPr/>
             <w:r>
-              <w:t xml:space="preserve">31 may – 28 jun</w:t>
+              <w:t xml:space="preserve">26 may – 30 jun</w:t>
             </w:r>
           </w:p>
         </w:tc>
@@ -334,7 +334,35 @@
     <w:p>
       <w:pPr/>
       <w:r>
-        <w:t xml:space="preserve">Fechas que conviene anotar ya: Sprint 1 el 14 de diciembre, propuesta de proyecto el 3 de mayo, presentación del proyecto el 14 de junio y simulacro de 6 horas el 21 de junio (probablemente un sábado).</w:t>
+        <w:t xml:space="preserve">Fechas que conviene anotar ya: Sprint 1 el 16 de diciembre, propuesta de proyecto el 28 de abril, presentación del proyecto el 16 de junio y simulacro de 6 horas el 23 de junio (probablemente un sábado cercano).</w:t>
+      </w:r>
+    </w:p>
+    <w:p>
+      <w:pPr/>
+      <w:r>
+        <w:t xml:space="preserve">En el Bloque 1 (Puente), antes de cada clase lees 2 o 3 notebooks en inglés del programa </w:t>
+      </w:r>
+      <w:hyperlink r:id="rId10" w:history="1">
+        <w:r>
+          <w:rPr>
+            <w:rStyle w:val="Hyperlink"/>
+          </w:rPr>
+          <w:t xml:space="preserve">MÓLÓ</w:t>
+        </w:r>
+      </w:hyperlink>
+      <w:r>
+        <w:t xml:space="preserve">. La lista de cada semana está en el </w:t>
+      </w:r>
+      <w:hyperlink r:id="rId11" w:history="1">
+        <w:r>
+          <w:rPr>
+            <w:rStyle w:val="Hyperlink"/>
+          </w:rPr>
+          <w:t xml:space="preserve">README</w:t>
+        </w:r>
+      </w:hyperlink>
+      <w:r>
+        <w:t xml:space="preserve">.</w:t>
       </w:r>
     </w:p>
     <w:p>
@@ -477,7 +505,7 @@
           <w:p>
             <w:pPr/>
             <w:r>
-              <w:t xml:space="preserve">El profesor explica un tema difícil (unas 11 veces en el año)</w:t>
+              <w:t xml:space="preserve">El profesor explica un tema difícil (unas 16 veces en el año)</w:t>
             </w:r>
           </w:p>
         </w:tc>
@@ -1129,7 +1157,7 @@
         <w:pStyle w:val="Heading2"/>
       </w:pPr>
       <w:r>
-        <w:t xml:space="preserve">Antes de la primera clase (Oct 5, 2026)</w:t>
+        <w:t xml:space="preserve">Antes de la primera clase (Oct 7, 2026)</w:t>
       </w:r>
     </w:p>
     <w:p>
@@ -1232,19 +1260,7 @@
         </w:numPr>
       </w:pPr>
       <w:r>
-        <w:t xml:space="preserve">☐ Traer una computadora portátil a cada clase, si es posible.</w:t>
-      </w:r>
-    </w:p>
-    <w:p>
-      <w:pPr>
-        <w:pStyle w:val="ListParagraph"/>
-        <w:numPr>
-          <w:ilvl w:val="0"/>
-          <w:numId w:val="5"/>
-        </w:numPr>
-      </w:pPr>
-      <w:r>
-        <w:t xml:space="preserve">☐ No hacer todavía el test de nivel: lo hacemos juntos en la primera clase.</w:t>
+        <w:t xml:space="preserve">☐ Tener una computadora con conexión estable a internet para las clases, que son en línea.</w:t>
       </w:r>
     </w:p>
     <w:p>
@@ -1290,7 +1306,7 @@
         </w:numPr>
       </w:pPr>
       <w:r>
-        <w:t xml:space="preserve">Día, horario y aula: por definir</w:t>
+        <w:t xml:space="preserve">Día: miércoles, en línea. Horario y enlace: por definir</w:t>
       </w:r>
     </w:p>
     <w:p>

</xml_diff>